<commit_message>
Fix docx: rebuild with valid paraIds, clean zip structure
</commit_message>
<xml_diff>
--- a/cloudwan_multiregion_test_plan_DRAFT(2).docx
+++ b/cloudwan_multiregion_test_plan_DRAFT(2).docx
@@ -22473,7 +22473,7 @@
                 <w:sz w:val="20"/>
                 <w:szCs w:val="20"/>
               </w:rPr>
-              <w:t>TC-15-003</w:t>
+              <w:t>TC-15-004</w:t>
             </w:r>
           </w:p>
         </w:tc>
@@ -22578,7 +22578,7 @@
                 <w:sz w:val="20"/>
                 <w:szCs w:val="20"/>
               </w:rPr>
-              <w:t>TC-15-003</w:t>
+              <w:t>TC-15-005</w:t>
             </w:r>
           </w:p>
         </w:tc>
@@ -22685,7 +22685,7 @@
                 <w:sz w:val="20"/>
                 <w:szCs w:val="20"/>
               </w:rPr>
-              <w:t>TC-15-003</w:t>
+              <w:t>TC-15-006</w:t>
             </w:r>
           </w:p>
         </w:tc>
@@ -22961,7 +22961,7 @@
             </w:p>
           </w:tc>
         </w:tr>
-        <w:tr w14:paraId="AA45698">
+        <w:tr>
           <w:tblPrEx>
             <w:tblCellMar>
               <w:top w:w="0" w:type="dxa"/>
@@ -22984,7 +22984,7 @@
                 <w:right w:w="120" w:type="dxa"/>
               </w:tcMar>
             </w:tcPr>
-            <w:p w14:paraId="AA60110">
+            <w:p>
               <w:r>
                 <w:rPr>
                   <w:sz w:val="20"/>
@@ -23010,7 +23010,7 @@
                 <w:right w:w="120" w:type="dxa"/>
               </w:tcMar>
             </w:tcPr>
-            <w:p w14:paraId="AA37696">
+            <w:p>
               <w:r>
                 <w:rPr>
                   <w:sz w:val="20"/>
@@ -23036,7 +23036,7 @@
                 <w:right w:w="120" w:type="dxa"/>
               </w:tcMar>
             </w:tcPr>
-            <w:p w14:paraId="AA60936">
+            <w:p>
               <w:r>
                 <w:rPr>
                   <w:sz w:val="20"/>
@@ -23062,18 +23062,10 @@
                 <w:right w:w="120" w:type="dxa"/>
               </w:tcMar>
             </w:tcPr>
-            <w:p w14:paraId="AA45698">
-              <w:r>
-                <w:rPr>
-                  <w:sz w:val="20"/>
-                  <w:szCs w:val="20"/>
-                </w:rPr>
-                <w:t/>
-              </w:r>
-            </w:p>
+            <w:p/>
           </w:tc>
         </w:tr>
-        <w:tr w14:paraId="AA88948">
+        <w:tr>
           <w:tblPrEx>
             <w:tblCellMar>
               <w:top w:w="0" w:type="dxa"/>
@@ -23097,7 +23089,7 @@
                 <w:right w:w="120" w:type="dxa"/>
               </w:tcMar>
             </w:tcPr>
-            <w:p w14:paraId="AA85462">
+            <w:p>
               <w:r>
                 <w:rPr>
                   <w:sz w:val="20"/>
@@ -23124,7 +23116,7 @@
                 <w:right w:w="120" w:type="dxa"/>
               </w:tcMar>
             </w:tcPr>
-            <w:p w14:paraId="AA98736">
+            <w:p>
               <w:r>
                 <w:rPr>
                   <w:sz w:val="20"/>
@@ -23151,7 +23143,7 @@
                 <w:right w:w="120" w:type="dxa"/>
               </w:tcMar>
             </w:tcPr>
-            <w:p w14:paraId="AA19902">
+            <w:p>
               <w:r>
                 <w:rPr>
                   <w:sz w:val="20"/>
@@ -23178,18 +23170,10 @@
                 <w:right w:w="120" w:type="dxa"/>
               </w:tcMar>
             </w:tcPr>
-            <w:p w14:paraId="AA88948">
-              <w:r>
-                <w:rPr>
-                  <w:sz w:val="20"/>
-                  <w:szCs w:val="20"/>
-                </w:rPr>
-                <w:t/>
-              </w:r>
-            </w:p>
+            <w:p/>
           </w:tc>
         </w:tr>
-        <w:tr w14:paraId="AA73831">
+        <w:tr>
           <w:tblPrEx>
             <w:tblCellMar>
               <w:top w:w="0" w:type="dxa"/>
@@ -23212,7 +23196,7 @@
                 <w:right w:w="120" w:type="dxa"/>
               </w:tcMar>
             </w:tcPr>
-            <w:p w14:paraId="AA86236">
+            <w:p>
               <w:r>
                 <w:rPr>
                   <w:sz w:val="20"/>
@@ -23238,7 +23222,7 @@
                 <w:right w:w="120" w:type="dxa"/>
               </w:tcMar>
             </w:tcPr>
-            <w:p w14:paraId="AA25615">
+            <w:p>
               <w:r>
                 <w:rPr>
                   <w:sz w:val="20"/>
@@ -23264,7 +23248,7 @@
                 <w:right w:w="120" w:type="dxa"/>
               </w:tcMar>
             </w:tcPr>
-            <w:p w14:paraId="AA53992">
+            <w:p>
               <w:r>
                 <w:rPr>
                   <w:sz w:val="20"/>
@@ -23290,18 +23274,10 @@
                 <w:right w:w="120" w:type="dxa"/>
               </w:tcMar>
             </w:tcPr>
-            <w:p w14:paraId="AA73831">
-              <w:r>
-                <w:rPr>
-                  <w:sz w:val="20"/>
-                  <w:szCs w:val="20"/>
-                </w:rPr>
-                <w:t/>
-              </w:r>
-            </w:p>
+            <w:p/>
           </w:tc>
         </w:tr>
-        <w:tr w14:paraId="AA82533">
+        <w:tr>
           <w:tblPrEx>
             <w:tblCellMar>
               <w:top w:w="0" w:type="dxa"/>
@@ -23325,7 +23301,7 @@
                 <w:right w:w="120" w:type="dxa"/>
               </w:tcMar>
             </w:tcPr>
-            <w:p w14:paraId="AA76392">
+            <w:p>
               <w:r>
                 <w:rPr>
                   <w:sz w:val="20"/>
@@ -23352,7 +23328,7 @@
                 <w:right w:w="120" w:type="dxa"/>
               </w:tcMar>
             </w:tcPr>
-            <w:p w14:paraId="AA59250">
+            <w:p>
               <w:r>
                 <w:rPr>
                   <w:sz w:val="20"/>
@@ -23379,7 +23355,7 @@
                 <w:right w:w="120" w:type="dxa"/>
               </w:tcMar>
             </w:tcPr>
-            <w:p w14:paraId="AA38863">
+            <w:p>
               <w:r>
                 <w:rPr>
                   <w:sz w:val="20"/>
@@ -23406,18 +23382,10 @@
                 <w:right w:w="120" w:type="dxa"/>
               </w:tcMar>
             </w:tcPr>
-            <w:p w14:paraId="AA82533">
-              <w:r>
-                <w:rPr>
-                  <w:sz w:val="20"/>
-                  <w:szCs w:val="20"/>
-                </w:rPr>
-                <w:t/>
-              </w:r>
-            </w:p>
+            <w:p/>
           </w:tc>
         </w:tr>
-        <w:tr w14:paraId="AA35450">
+        <w:tr>
           <w:tblPrEx>
             <w:tblCellMar>
               <w:top w:w="0" w:type="dxa"/>
@@ -23440,7 +23408,7 @@
                 <w:right w:w="120" w:type="dxa"/>
               </w:tcMar>
             </w:tcPr>
-            <w:p w14:paraId="AA31364">
+            <w:p>
               <w:r>
                 <w:rPr>
                   <w:sz w:val="20"/>
@@ -23466,7 +23434,7 @@
                 <w:right w:w="120" w:type="dxa"/>
               </w:tcMar>
             </w:tcPr>
-            <w:p w14:paraId="AA32778">
+            <w:p>
               <w:r>
                 <w:rPr>
                   <w:sz w:val="20"/>
@@ -23492,7 +23460,7 @@
                 <w:right w:w="120" w:type="dxa"/>
               </w:tcMar>
             </w:tcPr>
-            <w:p w14:paraId="AA99884">
+            <w:p>
               <w:r>
                 <w:rPr>
                   <w:sz w:val="20"/>
@@ -23518,18 +23486,10 @@
                 <w:right w:w="120" w:type="dxa"/>
               </w:tcMar>
             </w:tcPr>
-            <w:p w14:paraId="AA35450">
-              <w:r>
-                <w:rPr>
-                  <w:sz w:val="20"/>
-                  <w:szCs w:val="20"/>
-                </w:rPr>
-                <w:t/>
-              </w:r>
-            </w:p>
+            <w:p/>
           </w:tc>
         </w:tr>
-        <w:tr w14:paraId="AA81494">
+        <w:tr>
           <w:tblPrEx>
             <w:tblCellMar>
               <w:top w:w="0" w:type="dxa"/>
@@ -23553,7 +23513,7 @@
                 <w:right w:w="120" w:type="dxa"/>
               </w:tcMar>
             </w:tcPr>
-            <w:p w14:paraId="AA35973">
+            <w:p>
               <w:r>
                 <w:rPr>
                   <w:sz w:val="20"/>
@@ -23580,7 +23540,7 @@
                 <w:right w:w="120" w:type="dxa"/>
               </w:tcMar>
             </w:tcPr>
-            <w:p w14:paraId="AA78164">
+            <w:p>
               <w:r>
                 <w:rPr>
                   <w:sz w:val="20"/>
@@ -23607,7 +23567,7 @@
                 <w:right w:w="120" w:type="dxa"/>
               </w:tcMar>
             </w:tcPr>
-            <w:p w14:paraId="AA27831">
+            <w:p>
               <w:r>
                 <w:rPr>
                   <w:sz w:val="20"/>
@@ -23634,18 +23594,10 @@
                 <w:right w:w="120" w:type="dxa"/>
               </w:tcMar>
             </w:tcPr>
-            <w:p w14:paraId="AA81494">
-              <w:r>
-                <w:rPr>
-                  <w:sz w:val="20"/>
-                  <w:szCs w:val="20"/>
-                </w:rPr>
-                <w:t/>
-              </w:r>
-            </w:p>
+            <w:p/>
           </w:tc>
         </w:tr>
-        <w:tr w14:paraId="AA89636">
+        <w:tr>
           <w:tblPrEx>
             <w:tblCellMar>
               <w:top w:w="0" w:type="dxa"/>
@@ -23668,7 +23620,7 @@
                 <w:right w:w="120" w:type="dxa"/>
               </w:tcMar>
             </w:tcPr>
-            <w:p w14:paraId="AA53267">
+            <w:p>
               <w:r>
                 <w:rPr>
                   <w:sz w:val="20"/>
@@ -23694,7 +23646,7 @@
                 <w:right w:w="120" w:type="dxa"/>
               </w:tcMar>
             </w:tcPr>
-            <w:p w14:paraId="AA95302">
+            <w:p>
               <w:r>
                 <w:rPr>
                   <w:sz w:val="20"/>
@@ -23720,7 +23672,7 @@
                 <w:right w:w="120" w:type="dxa"/>
               </w:tcMar>
             </w:tcPr>
-            <w:p w14:paraId="AA17931">
+            <w:p>
               <w:r>
                 <w:rPr>
                   <w:sz w:val="20"/>
@@ -23746,18 +23698,10 @@
                 <w:right w:w="120" w:type="dxa"/>
               </w:tcMar>
             </w:tcPr>
-            <w:p w14:paraId="AA89636">
-              <w:r>
-                <w:rPr>
-                  <w:sz w:val="20"/>
-                  <w:szCs w:val="20"/>
-                </w:rPr>
-                <w:t/>
-              </w:r>
-            </w:p>
+            <w:p/>
           </w:tc>
         </w:tr>
-        <w:tr w14:paraId="AA62388">
+        <w:tr>
           <w:tblPrEx>
             <w:tblCellMar>
               <w:top w:w="0" w:type="dxa"/>
@@ -23781,7 +23725,7 @@
                 <w:right w:w="120" w:type="dxa"/>
               </w:tcMar>
             </w:tcPr>
-            <w:p w14:paraId="AA96709">
+            <w:p>
               <w:r>
                 <w:rPr>
                   <w:sz w:val="20"/>
@@ -23808,7 +23752,7 @@
                 <w:right w:w="120" w:type="dxa"/>
               </w:tcMar>
             </w:tcPr>
-            <w:p w14:paraId="AA08755">
+            <w:p>
               <w:r>
                 <w:rPr>
                   <w:sz w:val="20"/>
@@ -23835,7 +23779,7 @@
                 <w:right w:w="120" w:type="dxa"/>
               </w:tcMar>
             </w:tcPr>
-            <w:p w14:paraId="AA01536">
+            <w:p>
               <w:r>
                 <w:rPr>
                   <w:sz w:val="20"/>
@@ -23862,18 +23806,10 @@
                 <w:right w:w="120" w:type="dxa"/>
               </w:tcMar>
             </w:tcPr>
-            <w:p w14:paraId="AA62388">
-              <w:r>
-                <w:rPr>
-                  <w:sz w:val="20"/>
-                  <w:szCs w:val="20"/>
-                </w:rPr>
-                <w:t/>
-              </w:r>
-            </w:p>
+            <w:p/>
           </w:tc>
         </w:tr>
-        <w:tr w14:paraId="AA14829">
+        <w:tr>
           <w:tblPrEx>
             <w:tblCellMar>
               <w:top w:w="0" w:type="dxa"/>
@@ -23896,7 +23832,7 @@
                 <w:right w:w="120" w:type="dxa"/>
               </w:tcMar>
             </w:tcPr>
-            <w:p w14:paraId="AA29107">
+            <w:p>
               <w:r>
                 <w:rPr>
                   <w:sz w:val="20"/>
@@ -23922,7 +23858,7 @@
                 <w:right w:w="120" w:type="dxa"/>
               </w:tcMar>
             </w:tcPr>
-            <w:p w14:paraId="AA01445">
+            <w:p>
               <w:r>
                 <w:rPr>
                   <w:sz w:val="20"/>
@@ -23948,7 +23884,7 @@
                 <w:right w:w="120" w:type="dxa"/>
               </w:tcMar>
             </w:tcPr>
-            <w:p w14:paraId="AA40429">
+            <w:p>
               <w:r>
                 <w:rPr>
                   <w:sz w:val="20"/>
@@ -23974,15 +23910,7 @@
                 <w:right w:w="120" w:type="dxa"/>
               </w:tcMar>
             </w:tcPr>
-            <w:p w14:paraId="AA14829">
-              <w:r>
-                <w:rPr>
-                  <w:sz w:val="20"/>
-                  <w:szCs w:val="20"/>
-                </w:rPr>
-                <w:t/>
-              </w:r>
-            </w:p>
+            <w:p/>
           </w:tc>
         </w:tr>
       </w:tbl>

</xml_diff>